<commit_message>
data(c1a): lắp lại G10 sau #137 — A12 phủ 35 PMID của hai bản đề cương; G10 READY_FOR_G10_PI_RELEASE_APPROVAL
Sau khi #137 (đề cương nộp Hội đồng vào manifest G10) gộp 15/10/2026:
- khai áp dụng G10-T4 (mục đích phát hành ETHICS_SUBMISSION);
- check_citations.py --study với hợp PMID của DE_CUONG_THONG_NHAT + DE_CUONG_NOP_HOI_DONG: 35/35 sạch rút bài,
  phân giải được metadata ⇒ A12_RETRACTION_RECEIPT / A12_METADATA_RECEIPT;
- run_g10_assemble.py: kiem_de_cuong_nop_hoi_dong.py ĐẠT (mã 0); g10_quality_gate READY_FOR_G10_PI_RELEASE_APPROVAL;
- bảng trách nhiệm G10: AGENT_XONG_CHO_NGUOI — chỉ còn PI tự ký approve_gate.py --gate G10.
Còn cảnh báo (không chặn): 42 DOI không có PMID song song — kiểm rút bài qua DOI là việc tay; R6 thấy 1 mẫu số liệu
kết quả trong đề cương (số của nghiên cứu trước được trích ở phần tổng quan).

Co-Authored-By: Claude Opus 5.5 <noreply@anthropic.com>
</commit_message>
<xml_diff>
--- a/exports/hai-long-benh-nhan-C1a-BVQY175/DE_CUONG_THONG_NHAT_hai-long-benh-nhan-C1a-BVQY175.docx
+++ b/exports/hai-long-benh-nhan-C1a-BVQY175/DE_CUONG_THONG_NHAT_hai-long-benh-nhan-C1a-BVQY175.docx
@@ -248,7 +248,7 @@
           <w:i/>
           <w:sz w:val="22"/>
         </w:rPr>
-        <w:t xml:space="preserve"> Đề cương THỐNG NHẤT này do cổng G10 (assembler) lắp ráp TỰ ĐỘNG lúc 2026-10-15 18:39 từ checkpoint G0–G9 của đề tài `hai-long-benh-nhan-C1a-BVQY175`, theo mẫu 18 chương và ma trận bao phủ 24 thành phần protocol lõi của skill `nghien-cuu-y-khoa-chuan-quoc-te`. Dữ liệu cấu trúc (thiết kế, cỡ mẫu, công thức, đạo đức, chuẩn báo cáo, 16 PMID) lấy TỪ pipeline — không bịa. Mọi chỗ còn thiếu dữ liệu/thẩm quyền sẽ được đánh dấu NGAY TẠI ĐÓ bằng một trong các nhãn quy ước của skill (CẦN BỔ SUNG · CẦN XÁC NHẬN TẠI ĐƠN VỊ · DỰ THẢO · CẦN KIỂM CHỨNG NGUỒN CHÍNH THỨC — luôn đặt trong ngoặc vuông tại đúng vị trí thiếu). </w:t>
+        <w:t xml:space="preserve"> Đề cương THỐNG NHẤT này do cổng G10 (assembler) lắp ráp TỰ ĐỘNG lúc 2026-10-15 21:00 từ checkpoint G0–G9 của đề tài `hai-long-benh-nhan-C1a-BVQY175`, theo mẫu 18 chương và ma trận bao phủ 24 thành phần protocol lõi của skill `nghien-cuu-y-khoa-chuan-quoc-te`. Dữ liệu cấu trúc (thiết kế, cỡ mẫu, công thức, đạo đức, chuẩn báo cáo, 16 PMID) lấy TỪ pipeline — không bịa. Mọi chỗ còn thiếu dữ liệu/thẩm quyền sẽ được đánh dấu NGAY TẠI ĐÓ bằng một trong các nhãn quy ước của skill (CẦN BỔ SUNG · CẦN XÁC NHẬN TẠI ĐƠN VỊ · DỰ THẢO · CẦN KIỂM CHỨNG NGUỒN CHÍNH THỨC — luôn đặt trong ngoặc vuông tại đúng vị trí thiếu). </w:t>
       </w:r>
       <w:r>
         <w:rPr>
@@ -1155,7 +1155,7 @@
                 <w:i w:val="0"/>
                 <w:sz w:val="22"/>
               </w:rPr>
-              <w:t>2026-10-15 18:39</w:t>
+              <w:t>2026-10-15 21:00</w:t>
             </w:r>
           </w:p>
         </w:tc>

</xml_diff>

<commit_message>
data(c1a): lắp lại G10 sau #137 — A12 phủ 35 PMID của hai bản đề cương; G10 READY_FOR_G10_PI_RELEASE_APPROVAL (#139)
Sau khi #137 (đề cương nộp Hội đồng vào manifest G10) gộp 15/10/2026:
- khai áp dụng G10-T4 (mục đích phát hành ETHICS_SUBMISSION);
- check_citations.py --study với hợp PMID của DE_CUONG_THONG_NHAT + DE_CUONG_NOP_HOI_DONG: 35/35 sạch rút bài,
  phân giải được metadata ⇒ A12_RETRACTION_RECEIPT / A12_METADATA_RECEIPT;
- run_g10_assemble.py: kiem_de_cuong_nop_hoi_dong.py ĐẠT (mã 0); g10_quality_gate READY_FOR_G10_PI_RELEASE_APPROVAL;
- bảng trách nhiệm G10: AGENT_XONG_CHO_NGUOI — chỉ còn PI tự ký approve_gate.py --gate G10.
Còn cảnh báo (không chặn): 42 DOI không có PMID song song — kiểm rút bài qua DOI là việc tay; R6 thấy 1 mẫu số liệu
kết quả trong đề cương (số của nghiên cứu trước được trích ở phần tổng quan).

Co-authored-by: Claude Opus 5.5 <noreply@anthropic.com>
</commit_message>
<xml_diff>
--- a/exports/hai-long-benh-nhan-C1a-BVQY175/DE_CUONG_THONG_NHAT_hai-long-benh-nhan-C1a-BVQY175.docx
+++ b/exports/hai-long-benh-nhan-C1a-BVQY175/DE_CUONG_THONG_NHAT_hai-long-benh-nhan-C1a-BVQY175.docx
@@ -248,7 +248,7 @@
           <w:i/>
           <w:sz w:val="22"/>
         </w:rPr>
-        <w:t xml:space="preserve"> Đề cương THỐNG NHẤT này do cổng G10 (assembler) lắp ráp TỰ ĐỘNG lúc 2026-10-15 18:39 từ checkpoint G0–G9 của đề tài `hai-long-benh-nhan-C1a-BVQY175`, theo mẫu 18 chương và ma trận bao phủ 24 thành phần protocol lõi của skill `nghien-cuu-y-khoa-chuan-quoc-te`. Dữ liệu cấu trúc (thiết kế, cỡ mẫu, công thức, đạo đức, chuẩn báo cáo, 16 PMID) lấy TỪ pipeline — không bịa. Mọi chỗ còn thiếu dữ liệu/thẩm quyền sẽ được đánh dấu NGAY TẠI ĐÓ bằng một trong các nhãn quy ước của skill (CẦN BỔ SUNG · CẦN XÁC NHẬN TẠI ĐƠN VỊ · DỰ THẢO · CẦN KIỂM CHỨNG NGUỒN CHÍNH THỨC — luôn đặt trong ngoặc vuông tại đúng vị trí thiếu). </w:t>
+        <w:t xml:space="preserve"> Đề cương THỐNG NHẤT này do cổng G10 (assembler) lắp ráp TỰ ĐỘNG lúc 2026-10-15 21:00 từ checkpoint G0–G9 của đề tài `hai-long-benh-nhan-C1a-BVQY175`, theo mẫu 18 chương và ma trận bao phủ 24 thành phần protocol lõi của skill `nghien-cuu-y-khoa-chuan-quoc-te`. Dữ liệu cấu trúc (thiết kế, cỡ mẫu, công thức, đạo đức, chuẩn báo cáo, 16 PMID) lấy TỪ pipeline — không bịa. Mọi chỗ còn thiếu dữ liệu/thẩm quyền sẽ được đánh dấu NGAY TẠI ĐÓ bằng một trong các nhãn quy ước của skill (CẦN BỔ SUNG · CẦN XÁC NHẬN TẠI ĐƠN VỊ · DỰ THẢO · CẦN KIỂM CHỨNG NGUỒN CHÍNH THỨC — luôn đặt trong ngoặc vuông tại đúng vị trí thiếu). </w:t>
       </w:r>
       <w:r>
         <w:rPr>
@@ -1155,7 +1155,7 @@
                 <w:i w:val="0"/>
                 <w:sz w:val="22"/>
               </w:rPr>
-              <w:t>2026-10-15 18:39</w:t>
+              <w:t>2026-10-15 21:00</w:t>
             </w:r>
           </w:p>
         </w:tc>

</xml_diff>

<commit_message>
data(c1a): G10 khoá lại + PI ký lại 17:29 — bản kê khớp (manifest_match=True)
Lần ký G10 lúc 17:08 nằm trên bản kê cũ (G4_checkpoint đổi 17:07:35 sau lúc lắp gói ⇒
G10-AUTO-10 chặn). PI bấm lại «Chot G10 C1a» (lắp 17:26), từ chối bản ký cũ (10:25:57Z) và ký
lại (10:29:02Z). Chỉ đổi mốc giờ lắp + mã băm đề cương/gói: package_sha256 cbeb25e7…0034c0.
G10 chấm sống: PASS_G10_RELEASE_PACKAGE_LOCKED; G10-AUTO-03 fresh=True.

Co-Authored-By: Claude Opus 5.5 <noreply@anthropic.com>
</commit_message>
<xml_diff>
--- a/exports/hai-long-benh-nhan-C1a-BVQY175/DE_CUONG_THONG_NHAT_hai-long-benh-nhan-C1a-BVQY175.docx
+++ b/exports/hai-long-benh-nhan-C1a-BVQY175/DE_CUONG_THONG_NHAT_hai-long-benh-nhan-C1a-BVQY175.docx
@@ -248,7 +248,7 @@
           <w:i/>
           <w:sz w:val="22"/>
         </w:rPr>
-        <w:t xml:space="preserve"> Đề cương THỐNG NHẤT này do cổng G10 (assembler) lắp ráp TỰ ĐỘNG lúc 2026-10-17 17:07 từ checkpoint G0–G9 của đề tài `hai-long-benh-nhan-C1a-BVQY175`, theo mẫu 18 chương và ma trận bao phủ 24 thành phần protocol lõi của skill `nghien-cuu-y-khoa-chuan-quoc-te`. Dữ liệu cấu trúc (thiết kế, cỡ mẫu, công thức, đạo đức, chuẩn báo cáo, 16 PMID) lấy TỪ pipeline — không bịa. Mọi chỗ còn thiếu dữ liệu/thẩm quyền sẽ được đánh dấu NGAY TẠI ĐÓ bằng một trong các nhãn quy ước của skill (CẦN BỔ SUNG · CẦN XÁC NHẬN TẠI ĐƠN VỊ · DỰ THẢO · CẦN KIỂM CHỨNG NGUỒN CHÍNH THỨC — luôn đặt trong ngoặc vuông tại đúng vị trí thiếu). </w:t>
+        <w:t xml:space="preserve"> Đề cương THỐNG NHẤT này do cổng G10 (assembler) lắp ráp TỰ ĐỘNG lúc 2026-10-17 17:26 từ checkpoint G0–G9 của đề tài `hai-long-benh-nhan-C1a-BVQY175`, theo mẫu 18 chương và ma trận bao phủ 24 thành phần protocol lõi của skill `nghien-cuu-y-khoa-chuan-quoc-te`. Dữ liệu cấu trúc (thiết kế, cỡ mẫu, công thức, đạo đức, chuẩn báo cáo, 16 PMID) lấy TỪ pipeline — không bịa. Mọi chỗ còn thiếu dữ liệu/thẩm quyền sẽ được đánh dấu NGAY TẠI ĐÓ bằng một trong các nhãn quy ước của skill (CẦN BỔ SUNG · CẦN XÁC NHẬN TẠI ĐƠN VỊ · DỰ THẢO · CẦN KIỂM CHỨNG NGUỒN CHÍNH THỨC — luôn đặt trong ngoặc vuông tại đúng vị trí thiếu). </w:t>
       </w:r>
       <w:r>
         <w:rPr>
@@ -1155,7 +1155,7 @@
                 <w:i w:val="0"/>
                 <w:sz w:val="22"/>
               </w:rPr>
-              <w:t>2026-10-17 17:07</w:t>
+              <w:t>2026-10-17 17:26</w:t>
             </w:r>
           </w:p>
         </w:tc>

</xml_diff>